<commit_message>
Final report: right-aligned, B Nazanin font
Co-Authored-By: Claude Opus 5.5 <noreply@anthropic.com>
Claude-Session: https://claude.ai/code/session_01BdbLTZm7FbRHq1jy6RRJEV
</commit_message>
<xml_diff>
--- a/output/final_report/Final_Report_Bezan_Baran_Live.docx
+++ b/output/final_report/Final_Report_Bezan_Baran_Live.docx
@@ -10,12 +10,12 @@
       </w:pPr>
       <w:r>
         <w:rPr>
-          <w:rFonts w:ascii="DejaVu Sans" w:cs="DejaVu Sans" w:eastAsia="DejaVu Sans" w:hAnsi="DejaVu Sans"/>
+          <w:rFonts w:ascii="Times New Roman" w:cs="B Nazanin" w:eastAsia="B Nazanin" w:hAnsi="Times New Roman"/>
           <w:b/>
           <w:bCs/>
           <w:color w:val="1F3B63"/>
-          <w:sz w:val="28"/>
-          <w:szCs w:val="28"/>
+          <w:sz w:val="32"/>
+          <w:szCs w:val="32"/>
           <w:rtl/>
         </w:rPr>
         <w:t xml:space="preserve">گزارش نهایی پروژه: تبدیل نسخه استودیویی به نسخه لایو با کمک هوش مصنوعی</w:t>
@@ -29,10 +29,10 @@
       </w:pPr>
       <w:r>
         <w:rPr>
-          <w:rFonts w:ascii="DejaVu Sans" w:cs="DejaVu Sans" w:eastAsia="DejaVu Sans" w:hAnsi="DejaVu Sans"/>
+          <w:rFonts w:ascii="Times New Roman" w:cs="B Nazanin" w:eastAsia="B Nazanin" w:hAnsi="Times New Roman"/>
           <w:color w:val="555555"/>
-          <w:sz w:val="16"/>
-          <w:szCs w:val="16"/>
+          <w:sz w:val="21"/>
+          <w:szCs w:val="21"/>
           <w:rtl/>
         </w:rPr>
         <w:t xml:space="preserve">آهنگ «بزن باران» از ایهام  |  ابزار اصلی: Claude Code به‌همراه مدل‌های جداسازی صدا و Kits.ai</w:t>
@@ -49,12 +49,12 @@
       </w:pPr>
       <w:r>
         <w:rPr>
-          <w:rFonts w:ascii="DejaVu Sans" w:cs="DejaVu Sans" w:eastAsia="DejaVu Sans" w:hAnsi="DejaVu Sans"/>
+          <w:rFonts w:ascii="Times New Roman" w:cs="B Nazanin" w:eastAsia="B Nazanin" w:hAnsi="Times New Roman"/>
           <w:b/>
           <w:bCs/>
           <w:color w:val="1F3B63"/>
-          <w:sz w:val="25"/>
-          <w:szCs w:val="25"/>
+          <w:sz w:val="29"/>
+          <w:szCs w:val="29"/>
           <w:rtl/>
         </w:rPr>
         <w:t xml:space="preserve">۱. هدف و ایده</w:t>
@@ -64,13 +64,13 @@
       <w:pPr>
         <w:bidi/>
         <w:spacing w:after="80" w:line="276"/>
-        <w:jc w:val="both"/>
-      </w:pPr>
-      <w:r>
-        <w:rPr>
-          <w:rFonts w:ascii="DejaVu Sans" w:cs="DejaVu Sans" w:eastAsia="DejaVu Sans" w:hAnsi="DejaVu Sans"/>
-          <w:sz w:val="21"/>
-          <w:szCs w:val="21"/>
+        <w:jc w:val="right"/>
+      </w:pPr>
+      <w:r>
+        <w:rPr>
+          <w:rFonts w:ascii="Times New Roman" w:cs="B Nazanin" w:eastAsia="B Nazanin" w:hAnsi="Times New Roman"/>
+          <w:sz w:val="25"/>
+          <w:szCs w:val="25"/>
           <w:rtl/>
         </w:rPr>
         <w:t xml:space="preserve">هدف، تبدیل یک آهنگ استودیویی به اجرای زنده‌ی کنسرتی بود. برخلاف ابزارهایی مثل Suno که آهنگ را از نو می‌سازند، در این پروژه صدای اصلی خواننده‌ها و گروه حفظ شد و «فضای کنسرت» (شمارش درامر، تشویق، همخوانی مردم و صدای سالن) دور آن ساخته شد. کل کار با گفتگو و بازخورد شنیداری دانشجو هدایت شد: ۵۱ پرامپت و ۲۹ نسخه.</w:t>
@@ -87,12 +87,12 @@
       </w:pPr>
       <w:r>
         <w:rPr>
-          <w:rFonts w:ascii="DejaVu Sans" w:cs="DejaVu Sans" w:eastAsia="DejaVu Sans" w:hAnsi="DejaVu Sans"/>
+          <w:rFonts w:ascii="Times New Roman" w:cs="B Nazanin" w:eastAsia="B Nazanin" w:hAnsi="Times New Roman"/>
           <w:b/>
           <w:bCs/>
           <w:color w:val="1F3B63"/>
-          <w:sz w:val="25"/>
-          <w:szCs w:val="25"/>
+          <w:sz w:val="29"/>
+          <w:szCs w:val="29"/>
           <w:rtl/>
         </w:rPr>
         <w:t xml:space="preserve">۲. تحلیل اولیه</w:t>
@@ -107,24 +107,24 @@
         </w:numPr>
         <w:bidi/>
         <w:spacing w:after="30" w:line="252"/>
-        <w:jc w:val="both"/>
-      </w:pPr>
-      <w:r>
-        <w:rPr>
-          <w:rFonts w:ascii="DejaVu Sans" w:cs="DejaVu Sans" w:eastAsia="DejaVu Sans" w:hAnsi="DejaVu Sans"/>
+        <w:jc w:val="right"/>
+      </w:pPr>
+      <w:r>
+        <w:rPr>
+          <w:rFonts w:ascii="Times New Roman" w:cs="B Nazanin" w:eastAsia="B Nazanin" w:hAnsi="Times New Roman"/>
           <w:b/>
           <w:bCs/>
-          <w:sz w:val="21"/>
-          <w:szCs w:val="21"/>
+          <w:sz w:val="25"/>
+          <w:szCs w:val="25"/>
           <w:rtl/>
         </w:rPr>
         <w:t xml:space="preserve">نمونه استاد: </w:t>
       </w:r>
       <w:r>
         <w:rPr>
-          <w:rFonts w:ascii="DejaVu Sans" w:cs="DejaVu Sans" w:eastAsia="DejaVu Sans" w:hAnsi="DejaVu Sans"/>
-          <w:sz w:val="21"/>
-          <w:szCs w:val="21"/>
+          <w:rFonts w:ascii="Times New Roman" w:cs="B Nazanin" w:eastAsia="B Nazanin" w:hAnsi="Times New Roman"/>
+          <w:sz w:val="25"/>
+          <w:szCs w:val="25"/>
           <w:rtl/>
         </w:rPr>
         <w:t xml:space="preserve">وکال اصلی حفظ و موزیک بازسازی شده بود. بیس زیر ۶۰ هرتز از ۲۵٪ به ۱۱٪ انرژی و میانه‌ها (۲۵۰ تا ۱۰۰۰ هرتز) از ۲۱٪ به ۳۵٪ رسیده بود و استریو پهن‌تر شده بود. شمارش درامر، جیغ و همخوانی مردم هم داشت.</w:t>
@@ -139,24 +139,24 @@
         </w:numPr>
         <w:bidi/>
         <w:spacing w:after="30" w:line="252"/>
-        <w:jc w:val="both"/>
-      </w:pPr>
-      <w:r>
-        <w:rPr>
-          <w:rFonts w:ascii="DejaVu Sans" w:cs="DejaVu Sans" w:eastAsia="DejaVu Sans" w:hAnsi="DejaVu Sans"/>
+        <w:jc w:val="right"/>
+      </w:pPr>
+      <w:r>
+        <w:rPr>
+          <w:rFonts w:ascii="Times New Roman" w:cs="B Nazanin" w:eastAsia="B Nazanin" w:hAnsi="Times New Roman"/>
           <w:b/>
           <w:bCs/>
-          <w:sz w:val="21"/>
-          <w:szCs w:val="21"/>
+          <w:sz w:val="25"/>
+          <w:szCs w:val="25"/>
           <w:rtl/>
         </w:rPr>
         <w:t xml:space="preserve">آهنگ دانشجو: </w:t>
       </w:r>
       <w:r>
         <w:rPr>
-          <w:rFonts w:ascii="DejaVu Sans" w:cs="DejaVu Sans" w:eastAsia="DejaVu Sans" w:hAnsi="DejaVu Sans"/>
-          <w:sz w:val="21"/>
-          <w:szCs w:val="21"/>
+          <w:rFonts w:ascii="Times New Roman" w:cs="B Nazanin" w:eastAsia="B Nazanin" w:hAnsi="Times New Roman"/>
+          <w:sz w:val="25"/>
+          <w:szCs w:val="25"/>
           <w:rtl/>
         </w:rPr>
         <w:t xml:space="preserve">تمپو ۱۰۰، دو خواننده (خواننده ۲ در کُرس‌ها، یک اکتاو بالاتر)، و زمان‌بندی دقیق بخش‌ها از روی رنگ صدا (MFCC) و نت.</w:t>
@@ -171,24 +171,24 @@
         </w:numPr>
         <w:bidi/>
         <w:spacing w:after="30" w:line="252"/>
-        <w:jc w:val="both"/>
-      </w:pPr>
-      <w:r>
-        <w:rPr>
-          <w:rFonts w:ascii="DejaVu Sans" w:cs="DejaVu Sans" w:eastAsia="DejaVu Sans" w:hAnsi="DejaVu Sans"/>
+        <w:jc w:val="right"/>
+      </w:pPr>
+      <w:r>
+        <w:rPr>
+          <w:rFonts w:ascii="Times New Roman" w:cs="B Nazanin" w:eastAsia="B Nazanin" w:hAnsi="Times New Roman"/>
           <w:b/>
           <w:bCs/>
-          <w:sz w:val="21"/>
-          <w:szCs w:val="21"/>
+          <w:sz w:val="25"/>
+          <w:szCs w:val="25"/>
           <w:rtl/>
         </w:rPr>
         <w:t xml:space="preserve">نسخه لایو واقعی همین آهنگ: </w:t>
       </w:r>
       <w:r>
         <w:rPr>
-          <w:rFonts w:ascii="DejaVu Sans" w:cs="DejaVu Sans" w:eastAsia="DejaVu Sans" w:hAnsi="DejaVu Sans"/>
-          <w:sz w:val="21"/>
-          <w:szCs w:val="21"/>
+          <w:rFonts w:ascii="Times New Roman" w:cs="B Nazanin" w:eastAsia="B Nazanin" w:hAnsi="Times New Roman"/>
+          <w:sz w:val="25"/>
+          <w:szCs w:val="25"/>
           <w:rtl/>
         </w:rPr>
         <w:t xml:space="preserve">۲ نیم‌پرده بالاتر و ۳٪ تندتر اجرا شده است. از آن صدای واقعی تشویق و همخوانی مردم برداشته شد.</w:t>
@@ -205,12 +205,12 @@
       </w:pPr>
       <w:r>
         <w:rPr>
-          <w:rFonts w:ascii="DejaVu Sans" w:cs="DejaVu Sans" w:eastAsia="DejaVu Sans" w:hAnsi="DejaVu Sans"/>
+          <w:rFonts w:ascii="Times New Roman" w:cs="B Nazanin" w:eastAsia="B Nazanin" w:hAnsi="Times New Roman"/>
           <w:b/>
           <w:bCs/>
           <w:color w:val="1F3B63"/>
-          <w:sz w:val="25"/>
-          <w:szCs w:val="25"/>
+          <w:sz w:val="29"/>
+          <w:szCs w:val="29"/>
           <w:rtl/>
         </w:rPr>
         <w:t xml:space="preserve">۳. ابزارها</w:t>
@@ -220,13 +220,13 @@
       <w:pPr>
         <w:bidi/>
         <w:spacing w:after="80" w:line="276"/>
-        <w:jc w:val="both"/>
-      </w:pPr>
-      <w:r>
-        <w:rPr>
-          <w:rFonts w:ascii="DejaVu Sans" w:cs="DejaVu Sans" w:eastAsia="DejaVu Sans" w:hAnsi="DejaVu Sans"/>
-          <w:sz w:val="21"/>
-          <w:szCs w:val="21"/>
+        <w:jc w:val="right"/>
+      </w:pPr>
+      <w:r>
+        <w:rPr>
+          <w:rFonts w:ascii="Times New Roman" w:cs="B Nazanin" w:eastAsia="B Nazanin" w:hAnsi="Times New Roman"/>
+          <w:sz w:val="25"/>
+          <w:szCs w:val="25"/>
           <w:rtl/>
         </w:rPr>
         <w:t xml:space="preserve">Python (librosa، numpy، scipy، pedalboard، ffmpeg)؛ مدل‌های هوش مصنوعی جداسازی صدا UVR-MDX-NET-Voc_FT (وکال و موزیک) و UVR_MDXNET_KARA_2 (خواننده اصلی و صداهای پشت)؛ Kits.ai برای تبدیل صدای خواننده به صدای زنانه؛ و Claude Code برای تحلیل، ساخت، بررسی خودکار کیفیت و گزارش‌نویسی.</w:t>
@@ -243,12 +243,12 @@
       </w:pPr>
       <w:r>
         <w:rPr>
-          <w:rFonts w:ascii="DejaVu Sans" w:cs="DejaVu Sans" w:eastAsia="DejaVu Sans" w:hAnsi="DejaVu Sans"/>
+          <w:rFonts w:ascii="Times New Roman" w:cs="B Nazanin" w:eastAsia="B Nazanin" w:hAnsi="Times New Roman"/>
           <w:b/>
           <w:bCs/>
           <w:color w:val="1F3B63"/>
-          <w:sz w:val="25"/>
-          <w:szCs w:val="25"/>
+          <w:sz w:val="29"/>
+          <w:szCs w:val="29"/>
           <w:rtl/>
         </w:rPr>
         <w:t xml:space="preserve">۴. مسیر کار: روش‌های امتحان‌شده برای همخوانی جمعیت</w:t>
@@ -294,11 +294,11 @@
             </w:pPr>
             <w:r>
               <w:rPr>
-                <w:rFonts w:ascii="DejaVu Sans" w:cs="DejaVu Sans" w:eastAsia="DejaVu Sans" w:hAnsi="DejaVu Sans"/>
+                <w:rFonts w:ascii="Times New Roman" w:cs="B Nazanin" w:eastAsia="B Nazanin" w:hAnsi="Times New Roman"/>
                 <w:b/>
                 <w:bCs/>
-                <w:sz w:val="19"/>
-                <w:szCs w:val="19"/>
+                <w:sz w:val="23"/>
+                <w:szCs w:val="23"/>
                 <w:rtl/>
               </w:rPr>
               <w:t xml:space="preserve">روش</w:t>
@@ -323,11 +323,11 @@
             </w:pPr>
             <w:r>
               <w:rPr>
-                <w:rFonts w:ascii="DejaVu Sans" w:cs="DejaVu Sans" w:eastAsia="DejaVu Sans" w:hAnsi="DejaVu Sans"/>
+                <w:rFonts w:ascii="Times New Roman" w:cs="B Nazanin" w:eastAsia="B Nazanin" w:hAnsi="Times New Roman"/>
                 <w:b/>
                 <w:bCs/>
-                <w:sz w:val="19"/>
-                <w:szCs w:val="19"/>
+                <w:sz w:val="23"/>
+                <w:szCs w:val="23"/>
                 <w:rtl/>
               </w:rPr>
               <w:t xml:space="preserve">نتیجه</w:t>
@@ -352,11 +352,11 @@
             </w:pPr>
             <w:r>
               <w:rPr>
-                <w:rFonts w:ascii="DejaVu Sans" w:cs="DejaVu Sans" w:eastAsia="DejaVu Sans" w:hAnsi="DejaVu Sans"/>
+                <w:rFonts w:ascii="Times New Roman" w:cs="B Nazanin" w:eastAsia="B Nazanin" w:hAnsi="Times New Roman"/>
                 <w:b/>
                 <w:bCs/>
-                <w:sz w:val="19"/>
-                <w:szCs w:val="19"/>
+                <w:sz w:val="23"/>
+                <w:szCs w:val="23"/>
                 <w:rtl/>
               </w:rPr>
               <w:t xml:space="preserve">درس</w:t>
@@ -385,11 +385,10 @@
             </w:pPr>
             <w:r>
               <w:rPr>
-                <w:rFonts w:ascii="DejaVu Sans" w:cs="DejaVu Sans" w:eastAsia="DejaVu Sans" w:hAnsi="DejaVu Sans"/>
+                <w:rFonts w:ascii="Times New Roman" w:cs="B Nazanin" w:eastAsia="B Nazanin" w:hAnsi="Times New Roman"/>
                 <w:b w:val="false"/>
-                <w:bCs w:val="false"/>
-                <w:sz w:val="19"/>
-                <w:szCs w:val="19"/>
+                <w:sz w:val="23"/>
+                <w:szCs w:val="23"/>
                 <w:rtl/>
               </w:rPr>
               <w:t xml:space="preserve">کپی صدای خواننده با تغییر کوک و تأخیر (نسخه ۱ تا ۷)</w:t>
@@ -413,11 +412,10 @@
             </w:pPr>
             <w:r>
               <w:rPr>
-                <w:rFonts w:ascii="DejaVu Sans" w:cs="DejaVu Sans" w:eastAsia="DejaVu Sans" w:hAnsi="DejaVu Sans"/>
+                <w:rFonts w:ascii="Times New Roman" w:cs="B Nazanin" w:eastAsia="B Nazanin" w:hAnsi="Times New Roman"/>
                 <w:b w:val="false"/>
-                <w:bCs w:val="false"/>
-                <w:sz w:val="19"/>
-                <w:szCs w:val="19"/>
+                <w:sz w:val="23"/>
+                <w:szCs w:val="23"/>
                 <w:rtl/>
               </w:rPr>
               <w:t xml:space="preserve">حس «حمام»، اکو و صدای رباتی</w:t>
@@ -441,11 +439,10 @@
             </w:pPr>
             <w:r>
               <w:rPr>
-                <w:rFonts w:ascii="DejaVu Sans" w:cs="DejaVu Sans" w:eastAsia="DejaVu Sans" w:hAnsi="DejaVu Sans"/>
+                <w:rFonts w:ascii="Times New Roman" w:cs="B Nazanin" w:eastAsia="B Nazanin" w:hAnsi="Times New Roman"/>
                 <w:b w:val="false"/>
-                <w:bCs w:val="false"/>
-                <w:sz w:val="19"/>
-                <w:szCs w:val="19"/>
+                <w:sz w:val="23"/>
+                <w:szCs w:val="23"/>
                 <w:rtl/>
               </w:rPr>
               <w:t xml:space="preserve">کپیِ کمی دیرترِ صدای خواننده را گوش اکوی خود او می‌شنود</w:t>
@@ -474,11 +471,10 @@
             </w:pPr>
             <w:r>
               <w:rPr>
-                <w:rFonts w:ascii="DejaVu Sans" w:cs="DejaVu Sans" w:eastAsia="DejaVu Sans" w:hAnsi="DejaVu Sans"/>
+                <w:rFonts w:ascii="Times New Roman" w:cs="B Nazanin" w:eastAsia="B Nazanin" w:hAnsi="Times New Roman"/>
                 <w:b w:val="false"/>
-                <w:bCs w:val="false"/>
-                <w:sz w:val="19"/>
-                <w:szCs w:val="19"/>
+                <w:sz w:val="23"/>
+                <w:szCs w:val="23"/>
                 <w:rtl/>
               </w:rPr>
               <w:t xml:space="preserve">جمعیت بی‌کلام هم‌ریتم با خواننده (نسخه ۸ و ۹)</w:t>
@@ -502,11 +498,10 @@
             </w:pPr>
             <w:r>
               <w:rPr>
-                <w:rFonts w:ascii="DejaVu Sans" w:cs="DejaVu Sans" w:eastAsia="DejaVu Sans" w:hAnsi="DejaVu Sans"/>
+                <w:rFonts w:ascii="Times New Roman" w:cs="B Nazanin" w:eastAsia="B Nazanin" w:hAnsi="Times New Roman"/>
                 <w:b w:val="false"/>
-                <w:bCs w:val="false"/>
-                <w:sz w:val="19"/>
-                <w:szCs w:val="19"/>
+                <w:sz w:val="23"/>
+                <w:szCs w:val="23"/>
                 <w:rtl/>
               </w:rPr>
               <w:t xml:space="preserve">تمیز، ولی همخوانی شنیده نمی‌شد</w:t>
@@ -530,11 +525,10 @@
             </w:pPr>
             <w:r>
               <w:rPr>
-                <w:rFonts w:ascii="DejaVu Sans" w:cs="DejaVu Sans" w:eastAsia="DejaVu Sans" w:hAnsi="DejaVu Sans"/>
+                <w:rFonts w:ascii="Times New Roman" w:cs="B Nazanin" w:eastAsia="B Nazanin" w:hAnsi="Times New Roman"/>
                 <w:b w:val="false"/>
-                <w:bCs w:val="false"/>
-                <w:sz w:val="19"/>
-                <w:szCs w:val="19"/>
+                <w:sz w:val="23"/>
+                <w:szCs w:val="23"/>
                 <w:rtl/>
               </w:rPr>
               <w:t xml:space="preserve">بدون کلمه، حس همخوانی منتقل نمی‌شود</w:t>
@@ -563,11 +557,10 @@
             </w:pPr>
             <w:r>
               <w:rPr>
-                <w:rFonts w:ascii="DejaVu Sans" w:cs="DejaVu Sans" w:eastAsia="DejaVu Sans" w:hAnsi="DejaVu Sans"/>
+                <w:rFonts w:ascii="Times New Roman" w:cs="B Nazanin" w:eastAsia="B Nazanin" w:hAnsi="Times New Roman"/>
                 <w:b w:val="false"/>
-                <w:bCs w:val="false"/>
-                <w:sz w:val="19"/>
-                <w:szCs w:val="19"/>
+                <w:sz w:val="23"/>
+                <w:szCs w:val="23"/>
                 <w:rtl/>
               </w:rPr>
               <w:t xml:space="preserve">صداهای Kits.ai با زمان‌بندی جمله‌به‌جمله (نسخه ۱۰ و ۱۱)</w:t>
@@ -591,11 +584,10 @@
             </w:pPr>
             <w:r>
               <w:rPr>
-                <w:rFonts w:ascii="DejaVu Sans" w:cs="DejaVu Sans" w:eastAsia="DejaVu Sans" w:hAnsi="DejaVu Sans"/>
+                <w:rFonts w:ascii="Times New Roman" w:cs="B Nazanin" w:eastAsia="B Nazanin" w:hAnsi="Times New Roman"/>
                 <w:b w:val="false"/>
-                <w:bCs w:val="false"/>
-                <w:sz w:val="19"/>
-                <w:szCs w:val="19"/>
+                <w:sz w:val="23"/>
+                <w:szCs w:val="23"/>
                 <w:rtl/>
               </w:rPr>
               <w:t xml:space="preserve">طبیعی‌تر؛ برخی جمله‌ها رباتی</w:t>
@@ -619,11 +611,10 @@
             </w:pPr>
             <w:r>
               <w:rPr>
-                <w:rFonts w:ascii="DejaVu Sans" w:cs="DejaVu Sans" w:eastAsia="DejaVu Sans" w:hAnsi="DejaVu Sans"/>
+                <w:rFonts w:ascii="Times New Roman" w:cs="B Nazanin" w:eastAsia="B Nazanin" w:hAnsi="Times New Roman"/>
                 <w:b w:val="false"/>
-                <w:bCs w:val="false"/>
-                <w:sz w:val="19"/>
-                <w:szCs w:val="19"/>
+                <w:sz w:val="23"/>
+                <w:szCs w:val="23"/>
                 <w:rtl/>
               </w:rPr>
               <w:t xml:space="preserve">هر صدا یک «آدم» متفاوت است؛ کیفیت تبدیل در جمله‌ها فرق دارد</w:t>
@@ -652,11 +643,10 @@
             </w:pPr>
             <w:r>
               <w:rPr>
-                <w:rFonts w:ascii="DejaVu Sans" w:cs="DejaVu Sans" w:eastAsia="DejaVu Sans" w:hAnsi="DejaVu Sans"/>
+                <w:rFonts w:ascii="Times New Roman" w:cs="B Nazanin" w:eastAsia="B Nazanin" w:hAnsi="Times New Roman"/>
                 <w:b w:val="false"/>
-                <w:bCs w:val="false"/>
-                <w:sz w:val="19"/>
-                <w:szCs w:val="19"/>
+                <w:sz w:val="23"/>
+                <w:szCs w:val="23"/>
                 <w:rtl/>
               </w:rPr>
               <w:t xml:space="preserve">همخوانی واقعی از نسخه لایو (نسخه ۱۲ تا ۱۶)</w:t>
@@ -680,11 +670,10 @@
             </w:pPr>
             <w:r>
               <w:rPr>
-                <w:rFonts w:ascii="DejaVu Sans" w:cs="DejaVu Sans" w:eastAsia="DejaVu Sans" w:hAnsi="DejaVu Sans"/>
+                <w:rFonts w:ascii="Times New Roman" w:cs="B Nazanin" w:eastAsia="B Nazanin" w:hAnsi="Times New Roman"/>
                 <w:b w:val="false"/>
-                <w:bCs w:val="false"/>
-                <w:sz w:val="19"/>
-                <w:szCs w:val="19"/>
+                <w:sz w:val="23"/>
+                <w:szCs w:val="23"/>
                 <w:rtl/>
               </w:rPr>
               <w:t xml:space="preserve">واقعی‌ترین؛ در بند اول ناهم‌زمان</w:t>
@@ -708,11 +697,10 @@
             </w:pPr>
             <w:r>
               <w:rPr>
-                <w:rFonts w:ascii="DejaVu Sans" w:cs="DejaVu Sans" w:eastAsia="DejaVu Sans" w:hAnsi="DejaVu Sans"/>
+                <w:rFonts w:ascii="Times New Roman" w:cs="B Nazanin" w:eastAsia="B Nazanin" w:hAnsi="Times New Roman"/>
                 <w:b w:val="false"/>
-                <w:bCs w:val="false"/>
-                <w:sz w:val="19"/>
-                <w:szCs w:val="19"/>
+                <w:sz w:val="23"/>
+                <w:szCs w:val="23"/>
                 <w:rtl/>
               </w:rPr>
               <w:t xml:space="preserve">یک خواننده‌ی پشت صحنه وسط استریو بود؛ با برداشتن فقط کناره‌ها حذف شد</w:t>
@@ -741,11 +729,10 @@
             </w:pPr>
             <w:r>
               <w:rPr>
-                <w:rFonts w:ascii="DejaVu Sans" w:cs="DejaVu Sans" w:eastAsia="DejaVu Sans" w:hAnsi="DejaVu Sans"/>
+                <w:rFonts w:ascii="Times New Roman" w:cs="B Nazanin" w:eastAsia="B Nazanin" w:hAnsi="Times New Roman"/>
                 <w:b w:val="false"/>
-                <w:bCs w:val="false"/>
-                <w:sz w:val="19"/>
-                <w:szCs w:val="19"/>
+                <w:sz w:val="23"/>
+                <w:szCs w:val="23"/>
                 <w:rtl/>
               </w:rPr>
               <w:t xml:space="preserve">ضبط صدای خود دانشجو + تنظیم کوک خودکار (نسخه ۱۷)</w:t>
@@ -769,11 +756,10 @@
             </w:pPr>
             <w:r>
               <w:rPr>
-                <w:rFonts w:ascii="DejaVu Sans" w:cs="DejaVu Sans" w:eastAsia="DejaVu Sans" w:hAnsi="DejaVu Sans"/>
+                <w:rFonts w:ascii="Times New Roman" w:cs="B Nazanin" w:eastAsia="B Nazanin" w:hAnsi="Times New Roman"/>
                 <w:b w:val="false"/>
-                <w:bCs w:val="false"/>
-                <w:sz w:val="19"/>
-                <w:szCs w:val="19"/>
+                <w:sz w:val="23"/>
+                <w:szCs w:val="23"/>
                 <w:rtl/>
               </w:rPr>
               <w:t xml:space="preserve">کوک شد (اختلاف میانه ۰.۳ نیم‌پرده)</w:t>
@@ -797,11 +783,10 @@
             </w:pPr>
             <w:r>
               <w:rPr>
-                <w:rFonts w:ascii="DejaVu Sans" w:cs="DejaVu Sans" w:eastAsia="DejaVu Sans" w:hAnsi="DejaVu Sans"/>
+                <w:rFonts w:ascii="Times New Roman" w:cs="B Nazanin" w:eastAsia="B Nazanin" w:hAnsi="Times New Roman"/>
                 <w:b w:val="false"/>
-                <w:bCs w:val="false"/>
-                <w:sz w:val="19"/>
-                <w:szCs w:val="19"/>
+                <w:sz w:val="23"/>
+                <w:szCs w:val="23"/>
                 <w:rtl/>
               </w:rPr>
               <w:t xml:space="preserve">هم‌زمانی بدون پخش آهنگ هنگام ضبط سخت است</w:t>
@@ -814,13 +799,13 @@
       <w:pPr>
         <w:bidi/>
         <w:spacing w:after="30" w:line="276"/>
-        <w:jc w:val="both"/>
-      </w:pPr>
-      <w:r>
-        <w:rPr>
-          <w:rFonts w:ascii="DejaVu Sans" w:cs="DejaVu Sans" w:eastAsia="DejaVu Sans" w:hAnsi="DejaVu Sans"/>
-          <w:sz w:val="21"/>
-          <w:szCs w:val="21"/>
+        <w:jc w:val="right"/>
+      </w:pPr>
+      <w:r>
+        <w:rPr>
+          <w:rFonts w:ascii="Times New Roman" w:cs="B Nazanin" w:eastAsia="B Nazanin" w:hAnsi="Times New Roman"/>
+          <w:sz w:val="25"/>
+          <w:szCs w:val="25"/>
           <w:rtl/>
         </w:rPr>
         <w:t xml:space="preserve"/>
@@ -837,12 +822,12 @@
       </w:pPr>
       <w:r>
         <w:rPr>
-          <w:rFonts w:ascii="DejaVu Sans" w:cs="DejaVu Sans" w:eastAsia="DejaVu Sans" w:hAnsi="DejaVu Sans"/>
+          <w:rFonts w:ascii="Times New Roman" w:cs="B Nazanin" w:eastAsia="B Nazanin" w:hAnsi="Times New Roman"/>
           <w:b/>
           <w:bCs/>
           <w:color w:val="1F3B63"/>
-          <w:sz w:val="25"/>
-          <w:szCs w:val="25"/>
+          <w:sz w:val="29"/>
+          <w:szCs w:val="29"/>
           <w:rtl/>
         </w:rPr>
         <w:t xml:space="preserve">۵. نسخه نهایی (نسخه ۲۹)</w:t>
@@ -857,24 +842,24 @@
         </w:numPr>
         <w:bidi/>
         <w:spacing w:after="30" w:line="252"/>
-        <w:jc w:val="both"/>
-      </w:pPr>
-      <w:r>
-        <w:rPr>
-          <w:rFonts w:ascii="DejaVu Sans" w:cs="DejaVu Sans" w:eastAsia="DejaVu Sans" w:hAnsi="DejaVu Sans"/>
+        <w:jc w:val="right"/>
+      </w:pPr>
+      <w:r>
+        <w:rPr>
+          <w:rFonts w:ascii="Times New Roman" w:cs="B Nazanin" w:eastAsia="B Nazanin" w:hAnsi="Times New Roman"/>
           <w:b/>
           <w:bCs/>
-          <w:sz w:val="21"/>
-          <w:szCs w:val="21"/>
+          <w:sz w:val="25"/>
+          <w:szCs w:val="25"/>
           <w:rtl/>
         </w:rPr>
         <w:t xml:space="preserve">اینترو: </w:t>
       </w:r>
       <w:r>
         <w:rPr>
-          <w:rFonts w:ascii="DejaVu Sans" w:cs="DejaVu Sans" w:eastAsia="DejaVu Sans" w:hAnsi="DejaVu Sans"/>
-          <w:sz w:val="21"/>
-          <w:szCs w:val="21"/>
+          <w:rFonts w:ascii="Times New Roman" w:cs="B Nazanin" w:eastAsia="B Nazanin" w:hAnsi="Times New Roman"/>
+          <w:sz w:val="25"/>
+          <w:szCs w:val="25"/>
           <w:rtl/>
         </w:rPr>
         <w:t xml:space="preserve">تشویق واقعی، شمارش درامر روی ضرب، هی‌هی‌های ریتمیک نرم و اوج ناگهانی برای ورود خواننده ۱ که با شروع آواز ۹ دسی‌بل کم می‌شود.</w:t>
@@ -889,24 +874,24 @@
         </w:numPr>
         <w:bidi/>
         <w:spacing w:after="30" w:line="252"/>
-        <w:jc w:val="both"/>
-      </w:pPr>
-      <w:r>
-        <w:rPr>
-          <w:rFonts w:ascii="DejaVu Sans" w:cs="DejaVu Sans" w:eastAsia="DejaVu Sans" w:hAnsi="DejaVu Sans"/>
+        <w:jc w:val="right"/>
+      </w:pPr>
+      <w:r>
+        <w:rPr>
+          <w:rFonts w:ascii="Times New Roman" w:cs="B Nazanin" w:eastAsia="B Nazanin" w:hAnsi="Times New Roman"/>
           <w:b/>
           <w:bCs/>
-          <w:sz w:val="21"/>
-          <w:szCs w:val="21"/>
+          <w:sz w:val="25"/>
+          <w:szCs w:val="25"/>
           <w:rtl/>
         </w:rPr>
         <w:t xml:space="preserve">بند اول و دوم: </w:t>
       </w:r>
       <w:r>
         <w:rPr>
-          <w:rFonts w:ascii="DejaVu Sans" w:cs="DejaVu Sans" w:eastAsia="DejaVu Sans" w:hAnsi="DejaVu Sans"/>
-          <w:sz w:val="21"/>
-          <w:szCs w:val="21"/>
+          <w:rFonts w:ascii="Times New Roman" w:cs="B Nazanin" w:eastAsia="B Nazanin" w:hAnsi="Times New Roman"/>
+          <w:sz w:val="25"/>
+          <w:szCs w:val="25"/>
           <w:rtl/>
         </w:rPr>
         <w:t xml:space="preserve">جواب واقعی مردم («بزن باران بزن») در مکث خواننده؛ صدای خود دانشجو (کوک‌شده) زیر پیش‌کُرس؛ همخوانی واقعی لایو در بند دوم، هم‌ترازشده با DTW روی صدای خواننده‌ها (خطای کمتر از ۰.۱ ثانیه).</w:t>
@@ -921,24 +906,24 @@
         </w:numPr>
         <w:bidi/>
         <w:spacing w:after="30" w:line="252"/>
-        <w:jc w:val="both"/>
-      </w:pPr>
-      <w:r>
-        <w:rPr>
-          <w:rFonts w:ascii="DejaVu Sans" w:cs="DejaVu Sans" w:eastAsia="DejaVu Sans" w:hAnsi="DejaVu Sans"/>
+        <w:jc w:val="right"/>
+      </w:pPr>
+      <w:r>
+        <w:rPr>
+          <w:rFonts w:ascii="Times New Roman" w:cs="B Nazanin" w:eastAsia="B Nazanin" w:hAnsi="Times New Roman"/>
           <w:b/>
           <w:bCs/>
-          <w:sz w:val="21"/>
-          <w:szCs w:val="21"/>
+          <w:sz w:val="25"/>
+          <w:szCs w:val="25"/>
           <w:rtl/>
         </w:rPr>
         <w:t xml:space="preserve">کُرس‌ها: </w:t>
       </w:r>
       <w:r>
         <w:rPr>
-          <w:rFonts w:ascii="DejaVu Sans" w:cs="DejaVu Sans" w:eastAsia="DejaVu Sans" w:hAnsi="DejaVu Sans"/>
-          <w:sz w:val="21"/>
-          <w:szCs w:val="21"/>
+          <w:rFonts w:ascii="Times New Roman" w:cs="B Nazanin" w:eastAsia="B Nazanin" w:hAnsi="Times New Roman"/>
+          <w:sz w:val="25"/>
+          <w:szCs w:val="25"/>
           <w:rtl/>
         </w:rPr>
         <w:t xml:space="preserve">خواننده ۲ خشک و غالب؛ زنان Kits.ai دور و نرم، مثل تماشاچی؛ همخوانی واقعی «فقط مردمِ» لایو (۱:۵۰ تا ۱:۵۳) در همه‌ی جاهای هم‌ملودی (۱:۲۰، ۱:۳۹، ۳:۱۵، ۳:۵۳) با پایان کشیده و فید.</w:t>
@@ -953,24 +938,24 @@
         </w:numPr>
         <w:bidi/>
         <w:spacing w:after="30" w:line="252"/>
-        <w:jc w:val="both"/>
-      </w:pPr>
-      <w:r>
-        <w:rPr>
-          <w:rFonts w:ascii="DejaVu Sans" w:cs="DejaVu Sans" w:eastAsia="DejaVu Sans" w:hAnsi="DejaVu Sans"/>
+        <w:jc w:val="right"/>
+      </w:pPr>
+      <w:r>
+        <w:rPr>
+          <w:rFonts w:ascii="Times New Roman" w:cs="B Nazanin" w:eastAsia="B Nazanin" w:hAnsi="Times New Roman"/>
           <w:b/>
           <w:bCs/>
-          <w:sz w:val="21"/>
-          <w:szCs w:val="21"/>
+          <w:sz w:val="25"/>
+          <w:szCs w:val="25"/>
           <w:rtl/>
         </w:rPr>
         <w:t xml:space="preserve">پایان: </w:t>
       </w:r>
       <w:r>
         <w:rPr>
-          <w:rFonts w:ascii="DejaVu Sans" w:cs="DejaVu Sans" w:eastAsia="DejaVu Sans" w:hAnsi="DejaVu Sans"/>
-          <w:sz w:val="21"/>
-          <w:szCs w:val="21"/>
+          <w:rFonts w:ascii="Times New Roman" w:cs="B Nazanin" w:eastAsia="B Nazanin" w:hAnsi="Times New Roman"/>
+          <w:sz w:val="25"/>
+          <w:szCs w:val="25"/>
           <w:rtl/>
         </w:rPr>
         <w:t xml:space="preserve">در ۳:۵۳ خواننده‌ها ساکت می‌شوند و فقط مردم «هوا هوای خاطرات اوست» را می‌خوانند؛ بعد جیغ و تشویق. طول آهنگ برابر اصلی (۴:۱۳).</w:t>
@@ -985,24 +970,24 @@
         </w:numPr>
         <w:bidi/>
         <w:spacing w:after="30" w:line="252"/>
-        <w:jc w:val="both"/>
-      </w:pPr>
-      <w:r>
-        <w:rPr>
-          <w:rFonts w:ascii="DejaVu Sans" w:cs="DejaVu Sans" w:eastAsia="DejaVu Sans" w:hAnsi="DejaVu Sans"/>
+        <w:jc w:val="right"/>
+      </w:pPr>
+      <w:r>
+        <w:rPr>
+          <w:rFonts w:ascii="Times New Roman" w:cs="B Nazanin" w:eastAsia="B Nazanin" w:hAnsi="Times New Roman"/>
           <w:b/>
           <w:bCs/>
-          <w:sz w:val="21"/>
-          <w:szCs w:val="21"/>
+          <w:sz w:val="25"/>
+          <w:szCs w:val="25"/>
           <w:rtl/>
         </w:rPr>
         <w:t xml:space="preserve">میکس کنسرتی: </w:t>
       </w:r>
       <w:r>
         <w:rPr>
-          <w:rFonts w:ascii="DejaVu Sans" w:cs="DejaVu Sans" w:eastAsia="DejaVu Sans" w:hAnsi="DejaVu Sans"/>
-          <w:sz w:val="21"/>
-          <w:szCs w:val="21"/>
+          <w:rFonts w:ascii="Times New Roman" w:cs="B Nazanin" w:eastAsia="B Nazanin" w:hAnsi="Times New Roman"/>
+          <w:sz w:val="25"/>
+          <w:szCs w:val="25"/>
           <w:rtl/>
         </w:rPr>
         <w:t xml:space="preserve">بیس کمتر، میانه بیشتر، استریو پهن‌تر، ریورب سالن روی گروه، کمپرسور و لیمیتر (پیک ‎-1 dB)؛ سقف بلندی جمعیت ۱.۵ دسی‌بل زیر خواننده.</w:t>
@@ -1019,12 +1004,12 @@
       </w:pPr>
       <w:r>
         <w:rPr>
-          <w:rFonts w:ascii="DejaVu Sans" w:cs="DejaVu Sans" w:eastAsia="DejaVu Sans" w:hAnsi="DejaVu Sans"/>
+          <w:rFonts w:ascii="Times New Roman" w:cs="B Nazanin" w:eastAsia="B Nazanin" w:hAnsi="Times New Roman"/>
           <w:b/>
           <w:bCs/>
           <w:color w:val="1F3B63"/>
-          <w:sz w:val="25"/>
-          <w:szCs w:val="25"/>
+          <w:sz w:val="29"/>
+          <w:szCs w:val="29"/>
           <w:rtl/>
         </w:rPr>
         <w:t xml:space="preserve">۶. کنترل کیفیت و نقش دانشجو</w:t>
@@ -1034,13 +1019,13 @@
       <w:pPr>
         <w:bidi/>
         <w:spacing w:after="80" w:line="276"/>
-        <w:jc w:val="both"/>
-      </w:pPr>
-      <w:r>
-        <w:rPr>
-          <w:rFonts w:ascii="DejaVu Sans" w:cs="DejaVu Sans" w:eastAsia="DejaVu Sans" w:hAnsi="DejaVu Sans"/>
-          <w:sz w:val="21"/>
-          <w:szCs w:val="21"/>
+        <w:jc w:val="right"/>
+      </w:pPr>
+      <w:r>
+        <w:rPr>
+          <w:rFonts w:ascii="Times New Roman" w:cs="B Nazanin" w:eastAsia="B Nazanin" w:hAnsi="Times New Roman"/>
+          <w:sz w:val="25"/>
+          <w:szCs w:val="25"/>
           <w:rtl/>
         </w:rPr>
         <w:t xml:space="preserve">هوش مصنوعی صدا را نمی‌شنود. برای همین دو مسیر کنترل استفاده شد. (۱) بررسی خودکار (build/qa.py): کلیپ، تیک، شروع یا قطع ناگهانی، صدای تیز و سازگاری تک‌کاناله. هر مورد مشکوک با مقایسه با نسخه‌ی بدون جمعیت، دستی تأیید یا رد شد. (۲) گوش دانشجو: ایرادهایی مثل «حمومی بودن»، «رباتی بودن»، «ناهم‌زمانی در ۰:۲۹» و «قطع ناگهانی در ۱:۲۳» را دانشجو پیدا کرد. برای هر کدام علت فنی پیدا و اصلاح شد (مثلاً ریورب دوباره، نرم‌کننده‌ای که شروع صدا را حذف می‌کرد، یا جوابِ مردم که با خط اول اشتباه هم‌تراز شده بود).</w:t>
@@ -1057,12 +1042,12 @@
       </w:pPr>
       <w:r>
         <w:rPr>
-          <w:rFonts w:ascii="DejaVu Sans" w:cs="DejaVu Sans" w:eastAsia="DejaVu Sans" w:hAnsi="DejaVu Sans"/>
+          <w:rFonts w:ascii="Times New Roman" w:cs="B Nazanin" w:eastAsia="B Nazanin" w:hAnsi="Times New Roman"/>
           <w:b/>
           <w:bCs/>
           <w:color w:val="1F3B63"/>
-          <w:sz w:val="25"/>
-          <w:szCs w:val="25"/>
+          <w:sz w:val="29"/>
+          <w:szCs w:val="29"/>
           <w:rtl/>
         </w:rPr>
         <w:t xml:space="preserve">۷. جمع‌بندی و محدودیت‌ها</w:t>
@@ -1072,13 +1057,13 @@
       <w:pPr>
         <w:bidi/>
         <w:spacing w:after="80" w:line="276"/>
-        <w:jc w:val="both"/>
-      </w:pPr>
-      <w:r>
-        <w:rPr>
-          <w:rFonts w:ascii="DejaVu Sans" w:cs="DejaVu Sans" w:eastAsia="DejaVu Sans" w:hAnsi="DejaVu Sans"/>
-          <w:sz w:val="21"/>
-          <w:szCs w:val="21"/>
+        <w:jc w:val="right"/>
+      </w:pPr>
+      <w:r>
+        <w:rPr>
+          <w:rFonts w:ascii="Times New Roman" w:cs="B Nazanin" w:eastAsia="B Nazanin" w:hAnsi="Times New Roman"/>
+          <w:sz w:val="25"/>
+          <w:szCs w:val="25"/>
           <w:rtl/>
         </w:rPr>
         <w:t xml:space="preserve">نتیجه‌ی اصلی: بهترین همخوانی جمعیت از صدای واقعی آدم‌ها به دست می‌آید (نسخه لایو واقعی، صدای خود دانشجو، Kits.ai). شبیه‌سازی با کپی صدای خواننده، هر قدر هم تنظیم شود، اکو و صدای رباتی می‌دهد. محدودیت‌ها: Suno به‌خاطر تکرار زیاد شعر را نپذیرفت؛ دانلود مدل‌های تبدیل صدا در محیط کار مسدود بود؛ و تبدیل Kits.ai در برخی جمله‌ها رباتی بود و حذف شد. همه‌ی کدها، ۲۹ نسخه، پرامپت‌ها و گزارش کامل در مخزن گیت‌هاب ثبت شده است (REPORT.md، پوشه‌های build و output).</w:t>
@@ -1286,9 +1271,9 @@
   <w:docDefaults>
     <w:rPrDefault>
       <w:rPr>
-        <w:rFonts w:ascii="DejaVu Sans" w:cs="DejaVu Sans" w:eastAsia="DejaVu Sans" w:hAnsi="DejaVu Sans"/>
-        <w:sz w:val="21"/>
-        <w:szCs w:val="21"/>
+        <w:rFonts w:ascii="Times New Roman" w:cs="B Nazanin" w:eastAsia="B Nazanin" w:hAnsi="Times New Roman"/>
+        <w:sz w:val="25"/>
+        <w:szCs w:val="25"/>
         <w:rtl/>
       </w:rPr>
     </w:rPrDefault>

</xml_diff>

<commit_message>
Final report: right-align headings and bullets (logical start alignment)
Co-Authored-By: Claude Opus 5.5 <noreply@anthropic.com>
Claude-Session: https://claude.ai/code/session_01BdbLTZm7FbRHq1jy6RRJEV
</commit_message>
<xml_diff>
--- a/output/final_report/Final_Report_Bezan_Baran_Live.docx
+++ b/output/final_report/Final_Report_Bezan_Baran_Live.docx
@@ -45,7 +45,7 @@
         </w:pBdr>
         <w:bidi/>
         <w:spacing w:after="50" w:before="120"/>
-        <w:jc w:val="right"/>
+        <w:jc w:val="start"/>
       </w:pPr>
       <w:r>
         <w:rPr>
@@ -64,7 +64,7 @@
       <w:pPr>
         <w:bidi/>
         <w:spacing w:after="80" w:line="276"/>
-        <w:jc w:val="right"/>
+        <w:jc w:val="start"/>
       </w:pPr>
       <w:r>
         <w:rPr>
@@ -83,7 +83,7 @@
         </w:pBdr>
         <w:bidi/>
         <w:spacing w:after="50" w:before="120"/>
-        <w:jc w:val="right"/>
+        <w:jc w:val="start"/>
       </w:pPr>
       <w:r>
         <w:rPr>
@@ -107,7 +107,7 @@
         </w:numPr>
         <w:bidi/>
         <w:spacing w:after="30" w:line="252"/>
-        <w:jc w:val="right"/>
+        <w:jc w:val="start"/>
       </w:pPr>
       <w:r>
         <w:rPr>
@@ -139,7 +139,7 @@
         </w:numPr>
         <w:bidi/>
         <w:spacing w:after="30" w:line="252"/>
-        <w:jc w:val="right"/>
+        <w:jc w:val="start"/>
       </w:pPr>
       <w:r>
         <w:rPr>
@@ -171,7 +171,7 @@
         </w:numPr>
         <w:bidi/>
         <w:spacing w:after="30" w:line="252"/>
-        <w:jc w:val="right"/>
+        <w:jc w:val="start"/>
       </w:pPr>
       <w:r>
         <w:rPr>
@@ -201,7 +201,7 @@
         </w:pBdr>
         <w:bidi/>
         <w:spacing w:after="50" w:before="120"/>
-        <w:jc w:val="right"/>
+        <w:jc w:val="start"/>
       </w:pPr>
       <w:r>
         <w:rPr>
@@ -220,7 +220,7 @@
       <w:pPr>
         <w:bidi/>
         <w:spacing w:after="80" w:line="276"/>
-        <w:jc w:val="right"/>
+        <w:jc w:val="start"/>
       </w:pPr>
       <w:r>
         <w:rPr>
@@ -239,7 +239,7 @@
         </w:pBdr>
         <w:bidi/>
         <w:spacing w:after="50" w:before="120"/>
-        <w:jc w:val="right"/>
+        <w:jc w:val="start"/>
       </w:pPr>
       <w:r>
         <w:rPr>
@@ -290,7 +290,7 @@
           <w:p>
             <w:pPr>
               <w:bidi/>
-              <w:jc w:val="right"/>
+              <w:jc w:val="start"/>
             </w:pPr>
             <w:r>
               <w:rPr>
@@ -319,7 +319,7 @@
           <w:p>
             <w:pPr>
               <w:bidi/>
-              <w:jc w:val="right"/>
+              <w:jc w:val="start"/>
             </w:pPr>
             <w:r>
               <w:rPr>
@@ -348,7 +348,7 @@
           <w:p>
             <w:pPr>
               <w:bidi/>
-              <w:jc w:val="right"/>
+              <w:jc w:val="start"/>
             </w:pPr>
             <w:r>
               <w:rPr>
@@ -381,7 +381,7 @@
           <w:p>
             <w:pPr>
               <w:bidi/>
-              <w:jc w:val="right"/>
+              <w:jc w:val="start"/>
             </w:pPr>
             <w:r>
               <w:rPr>
@@ -408,7 +408,7 @@
           <w:p>
             <w:pPr>
               <w:bidi/>
-              <w:jc w:val="right"/>
+              <w:jc w:val="start"/>
             </w:pPr>
             <w:r>
               <w:rPr>
@@ -435,7 +435,7 @@
           <w:p>
             <w:pPr>
               <w:bidi/>
-              <w:jc w:val="right"/>
+              <w:jc w:val="start"/>
             </w:pPr>
             <w:r>
               <w:rPr>
@@ -467,7 +467,7 @@
           <w:p>
             <w:pPr>
               <w:bidi/>
-              <w:jc w:val="right"/>
+              <w:jc w:val="start"/>
             </w:pPr>
             <w:r>
               <w:rPr>
@@ -494,7 +494,7 @@
           <w:p>
             <w:pPr>
               <w:bidi/>
-              <w:jc w:val="right"/>
+              <w:jc w:val="start"/>
             </w:pPr>
             <w:r>
               <w:rPr>
@@ -521,7 +521,7 @@
           <w:p>
             <w:pPr>
               <w:bidi/>
-              <w:jc w:val="right"/>
+              <w:jc w:val="start"/>
             </w:pPr>
             <w:r>
               <w:rPr>
@@ -553,7 +553,7 @@
           <w:p>
             <w:pPr>
               <w:bidi/>
-              <w:jc w:val="right"/>
+              <w:jc w:val="start"/>
             </w:pPr>
             <w:r>
               <w:rPr>
@@ -580,7 +580,7 @@
           <w:p>
             <w:pPr>
               <w:bidi/>
-              <w:jc w:val="right"/>
+              <w:jc w:val="start"/>
             </w:pPr>
             <w:r>
               <w:rPr>
@@ -607,7 +607,7 @@
           <w:p>
             <w:pPr>
               <w:bidi/>
-              <w:jc w:val="right"/>
+              <w:jc w:val="start"/>
             </w:pPr>
             <w:r>
               <w:rPr>
@@ -639,7 +639,7 @@
           <w:p>
             <w:pPr>
               <w:bidi/>
-              <w:jc w:val="right"/>
+              <w:jc w:val="start"/>
             </w:pPr>
             <w:r>
               <w:rPr>
@@ -666,7 +666,7 @@
           <w:p>
             <w:pPr>
               <w:bidi/>
-              <w:jc w:val="right"/>
+              <w:jc w:val="start"/>
             </w:pPr>
             <w:r>
               <w:rPr>
@@ -693,7 +693,7 @@
           <w:p>
             <w:pPr>
               <w:bidi/>
-              <w:jc w:val="right"/>
+              <w:jc w:val="start"/>
             </w:pPr>
             <w:r>
               <w:rPr>
@@ -725,7 +725,7 @@
           <w:p>
             <w:pPr>
               <w:bidi/>
-              <w:jc w:val="right"/>
+              <w:jc w:val="start"/>
             </w:pPr>
             <w:r>
               <w:rPr>
@@ -752,7 +752,7 @@
           <w:p>
             <w:pPr>
               <w:bidi/>
-              <w:jc w:val="right"/>
+              <w:jc w:val="start"/>
             </w:pPr>
             <w:r>
               <w:rPr>
@@ -779,7 +779,7 @@
           <w:p>
             <w:pPr>
               <w:bidi/>
-              <w:jc w:val="right"/>
+              <w:jc w:val="start"/>
             </w:pPr>
             <w:r>
               <w:rPr>
@@ -799,7 +799,7 @@
       <w:pPr>
         <w:bidi/>
         <w:spacing w:after="30" w:line="276"/>
-        <w:jc w:val="right"/>
+        <w:jc w:val="start"/>
       </w:pPr>
       <w:r>
         <w:rPr>
@@ -818,7 +818,7 @@
         </w:pBdr>
         <w:bidi/>
         <w:spacing w:after="50" w:before="120"/>
-        <w:jc w:val="right"/>
+        <w:jc w:val="start"/>
       </w:pPr>
       <w:r>
         <w:rPr>
@@ -842,7 +842,7 @@
         </w:numPr>
         <w:bidi/>
         <w:spacing w:after="30" w:line="252"/>
-        <w:jc w:val="right"/>
+        <w:jc w:val="start"/>
       </w:pPr>
       <w:r>
         <w:rPr>
@@ -874,7 +874,7 @@
         </w:numPr>
         <w:bidi/>
         <w:spacing w:after="30" w:line="252"/>
-        <w:jc w:val="right"/>
+        <w:jc w:val="start"/>
       </w:pPr>
       <w:r>
         <w:rPr>
@@ -906,7 +906,7 @@
         </w:numPr>
         <w:bidi/>
         <w:spacing w:after="30" w:line="252"/>
-        <w:jc w:val="right"/>
+        <w:jc w:val="start"/>
       </w:pPr>
       <w:r>
         <w:rPr>
@@ -938,7 +938,7 @@
         </w:numPr>
         <w:bidi/>
         <w:spacing w:after="30" w:line="252"/>
-        <w:jc w:val="right"/>
+        <w:jc w:val="start"/>
       </w:pPr>
       <w:r>
         <w:rPr>
@@ -970,7 +970,7 @@
         </w:numPr>
         <w:bidi/>
         <w:spacing w:after="30" w:line="252"/>
-        <w:jc w:val="right"/>
+        <w:jc w:val="start"/>
       </w:pPr>
       <w:r>
         <w:rPr>
@@ -1000,7 +1000,7 @@
         </w:pBdr>
         <w:bidi/>
         <w:spacing w:after="50" w:before="120"/>
-        <w:jc w:val="right"/>
+        <w:jc w:val="start"/>
       </w:pPr>
       <w:r>
         <w:rPr>
@@ -1019,7 +1019,7 @@
       <w:pPr>
         <w:bidi/>
         <w:spacing w:after="80" w:line="276"/>
-        <w:jc w:val="right"/>
+        <w:jc w:val="start"/>
       </w:pPr>
       <w:r>
         <w:rPr>
@@ -1038,7 +1038,7 @@
         </w:pBdr>
         <w:bidi/>
         <w:spacing w:after="50" w:before="120"/>
-        <w:jc w:val="right"/>
+        <w:jc w:val="start"/>
       </w:pPr>
       <w:r>
         <w:rPr>
@@ -1057,7 +1057,7 @@
       <w:pPr>
         <w:bidi/>
         <w:spacing w:after="80" w:line="276"/>
-        <w:jc w:val="right"/>
+        <w:jc w:val="start"/>
       </w:pPr>
       <w:r>
         <w:rPr>
@@ -1245,9 +1245,9 @@
       <w:start w:val="1"/>
       <w:numFmt w:val="bullet"/>
       <w:lvlText w:val="•"/>
-      <w:lvlJc w:val="right"/>
-      <w:pPr>
-        <w:ind w:right="300" w:hanging="200"/>
+      <w:lvlJc w:val="left"/>
+      <w:pPr>
+        <w:ind w:start="300" w:hanging="200"/>
       </w:pPr>
     </w:lvl>
   </w:abstractNum>

</xml_diff>